<commit_message>
docs: add Linux server setup, systemd auto-restart, and cron backup instructions to production architecture PDF
</commit_message>
<xml_diff>
--- a/docs/production_architecture_stack.docx
+++ b/docs/production_architecture_stack.docx
@@ -22,7 +22,7 @@
         <w:spacing w:after="120"/>
       </w:pPr>
       <w:r>
-        <w:t>This document outlines the recommended production-grade technology stack for OptiFlow, specifically designed for seamless switching between Cloud and On-Premise deployments.</w:t>
+        <w:t>This document outlines the recommended production-grade technology stack for OptiFlow, specifically designed for seamless switching between Cloud and On-Premise deployments on Linux OS.</w:t>
       </w:r>
     </w:p>
     <w:p>
@@ -67,7 +67,7 @@
       <w:tr>
         <w:tc>
           <w:tcPr>
-            <w:tcW w:type="dxa" w:w="2592"/>
+            <w:tcW w:type="dxa" w:w="2880"/>
             <w:shd w:val="clear" w:color="auto" w:fill="0B1D3A"/>
           </w:tcPr>
           <w:p>
@@ -103,7 +103,7 @@
         </w:tc>
         <w:tc>
           <w:tcPr>
-            <w:tcW w:type="dxa" w:w="3600"/>
+            <w:tcW w:type="dxa" w:w="3312"/>
             <w:shd w:val="clear" w:color="auto" w:fill="0B1D3A"/>
           </w:tcPr>
           <w:p>
@@ -123,7 +123,7 @@
       <w:tr>
         <w:tc>
           <w:tcPr>
-            <w:tcW w:type="dxa" w:w="2592"/>
+            <w:tcW w:type="dxa" w:w="2880"/>
           </w:tcPr>
           <w:p>
             <w:pPr>
@@ -159,7 +159,7 @@
         </w:tc>
         <w:tc>
           <w:tcPr>
-            <w:tcW w:type="dxa" w:w="3600"/>
+            <w:tcW w:type="dxa" w:w="3312"/>
           </w:tcPr>
           <w:p>
             <w:pPr>
@@ -174,7 +174,7 @@
       <w:tr>
         <w:tc>
           <w:tcPr>
-            <w:tcW w:type="dxa" w:w="2592"/>
+            <w:tcW w:type="dxa" w:w="2880"/>
           </w:tcPr>
           <w:p>
             <w:pPr>
@@ -210,7 +210,7 @@
         </w:tc>
         <w:tc>
           <w:tcPr>
-            <w:tcW w:type="dxa" w:w="3600"/>
+            <w:tcW w:type="dxa" w:w="3312"/>
           </w:tcPr>
           <w:p>
             <w:pPr>
@@ -225,7 +225,7 @@
       <w:tr>
         <w:tc>
           <w:tcPr>
-            <w:tcW w:type="dxa" w:w="2592"/>
+            <w:tcW w:type="dxa" w:w="2880"/>
           </w:tcPr>
           <w:p>
             <w:pPr>
@@ -261,7 +261,7 @@
         </w:tc>
         <w:tc>
           <w:tcPr>
-            <w:tcW w:type="dxa" w:w="3600"/>
+            <w:tcW w:type="dxa" w:w="3312"/>
           </w:tcPr>
           <w:p>
             <w:pPr>
@@ -276,7 +276,7 @@
       <w:tr>
         <w:tc>
           <w:tcPr>
-            <w:tcW w:type="dxa" w:w="2592"/>
+            <w:tcW w:type="dxa" w:w="2880"/>
           </w:tcPr>
           <w:p>
             <w:pPr>
@@ -312,7 +312,7 @@
         </w:tc>
         <w:tc>
           <w:tcPr>
-            <w:tcW w:type="dxa" w:w="3600"/>
+            <w:tcW w:type="dxa" w:w="3312"/>
           </w:tcPr>
           <w:p>
             <w:pPr>
@@ -327,7 +327,7 @@
       <w:tr>
         <w:tc>
           <w:tcPr>
-            <w:tcW w:type="dxa" w:w="2592"/>
+            <w:tcW w:type="dxa" w:w="2880"/>
           </w:tcPr>
           <w:p>
             <w:pPr>
@@ -363,7 +363,7 @@
         </w:tc>
         <w:tc>
           <w:tcPr>
-            <w:tcW w:type="dxa" w:w="3600"/>
+            <w:tcW w:type="dxa" w:w="3312"/>
           </w:tcPr>
           <w:p>
             <w:pPr>
@@ -378,7 +378,7 @@
       <w:tr>
         <w:tc>
           <w:tcPr>
-            <w:tcW w:type="dxa" w:w="2592"/>
+            <w:tcW w:type="dxa" w:w="2880"/>
           </w:tcPr>
           <w:p>
             <w:pPr>
@@ -414,7 +414,7 @@
         </w:tc>
         <w:tc>
           <w:tcPr>
-            <w:tcW w:type="dxa" w:w="3600"/>
+            <w:tcW w:type="dxa" w:w="3312"/>
           </w:tcPr>
           <w:p>
             <w:pPr>
@@ -429,7 +429,7 @@
       <w:tr>
         <w:tc>
           <w:tcPr>
-            <w:tcW w:type="dxa" w:w="2592"/>
+            <w:tcW w:type="dxa" w:w="2880"/>
           </w:tcPr>
           <w:p>
             <w:pPr>
@@ -465,7 +465,7 @@
         </w:tc>
         <w:tc>
           <w:tcPr>
-            <w:tcW w:type="dxa" w:w="3600"/>
+            <w:tcW w:type="dxa" w:w="3312"/>
           </w:tcPr>
           <w:p>
             <w:pPr>
@@ -507,7 +507,7 @@
           <w:color w:val="053364"/>
           <w:sz w:val="28"/>
         </w:rPr>
-        <w:t>Cloud vs. On-Premise Deployment Strategy</w:t>
+        <w:t>On-Premise Linux Server Environment (Ubuntu / RHEL / Rocky Linux)</w:t>
       </w:r>
     </w:p>
     <w:p>
@@ -515,7 +515,43 @@
         <w:spacing w:after="120"/>
       </w:pPr>
       <w:r>
-        <w:t>Because the entire application is containerized with Docker, the deployment architecture is identical in both environments.</w:t>
+        <w:t xml:space="preserve">For on-premise deployment, OptiFlow is designed to run directly on standard enterprise Linux operating systems (e.g., </w:t>
+      </w:r>
+      <w:r>
+        <w:rPr>
+          <w:b/>
+        </w:rPr>
+        <w:t>Ubuntu Server 22.04 LTS</w:t>
+      </w:r>
+      <w:r>
+        <w:t xml:space="preserve">, </w:t>
+      </w:r>
+      <w:r>
+        <w:rPr>
+          <w:b/>
+        </w:rPr>
+        <w:t>Debian 12</w:t>
+      </w:r>
+      <w:r>
+        <w:t xml:space="preserve">, </w:t>
+      </w:r>
+      <w:r>
+        <w:rPr>
+          <w:b/>
+        </w:rPr>
+        <w:t>RHEL 9</w:t>
+      </w:r>
+      <w:r>
+        <w:t xml:space="preserve">, or </w:t>
+      </w:r>
+      <w:r>
+        <w:rPr>
+          <w:b/>
+        </w:rPr>
+        <w:t>Rocky Linux 9</w:t>
+      </w:r>
+      <w:r>
+        <w:t>).</w:t>
       </w:r>
     </w:p>
     <w:p>
@@ -530,7 +566,7 @@
           <w:color w:val="0F172A"/>
           <w:sz w:val="24"/>
         </w:rPr>
-        <w:t>1. Cloud Deployment (AWS / GCP / Azure)</w:t>
+        <w:t>1. Linux Server Prerequisites</w:t>
       </w:r>
     </w:p>
     <w:p>
@@ -550,10 +586,32 @@
         <w:rPr>
           <w:b/>
         </w:rPr>
-        <w:t>Hosting</w:t>
+        <w:t>Docker Engine &amp; Docker Compose</w:t>
       </w:r>
       <w:r>
-        <w:t>: The Docker containers run on a virtual cloud server (e.g., AWS EC2 or GCP Compute Engine).</w:t>
+        <w:t>: The server only requires Docker installed (</w:t>
+      </w:r>
+      <w:r>
+        <w:rPr>
+          <w:rFonts w:ascii="Courier New" w:hAnsi="Courier New"/>
+          <w:color w:val="C53030"/>
+          <w:sz w:val="19"/>
+        </w:rPr>
+        <w:t>docker-ce</w:t>
+      </w:r>
+      <w:r>
+        <w:t xml:space="preserve"> and </w:t>
+      </w:r>
+      <w:r>
+        <w:rPr>
+          <w:rFonts w:ascii="Courier New" w:hAnsi="Courier New"/>
+          <w:color w:val="C53030"/>
+          <w:sz w:val="19"/>
+        </w:rPr>
+        <w:t>docker-compose-plugin</w:t>
+      </w:r>
+      <w:r>
+        <w:t>). No manual Python, Node.js, or PostgreSQL installations are needed on the host OS.</w:t>
       </w:r>
     </w:p>
     <w:p>
@@ -573,10 +631,409 @@
         <w:rPr>
           <w:b/>
         </w:rPr>
-        <w:t>Database</w:t>
+        <w:t>Network &amp; Firewall</w:t>
       </w:r>
       <w:r>
-        <w:t>: Managed database service (e.g., AWS RDS PostgreSQL).</w:t>
+        <w:t xml:space="preserve">: Open inbound port </w:t>
+      </w:r>
+      <w:r>
+        <w:rPr>
+          <w:rFonts w:ascii="Courier New" w:hAnsi="Courier New"/>
+          <w:color w:val="C53030"/>
+          <w:sz w:val="19"/>
+        </w:rPr>
+        <w:t>80</w:t>
+      </w:r>
+      <w:r>
+        <w:t xml:space="preserve"> (HTTP) and port </w:t>
+      </w:r>
+      <w:r>
+        <w:rPr>
+          <w:rFonts w:ascii="Courier New" w:hAnsi="Courier New"/>
+          <w:color w:val="C53030"/>
+          <w:sz w:val="19"/>
+        </w:rPr>
+        <w:t>443</w:t>
+      </w:r>
+      <w:r>
+        <w:t xml:space="preserve"> (HTTPS) on the Linux firewall (</w:t>
+      </w:r>
+      <w:r>
+        <w:rPr>
+          <w:rFonts w:ascii="Courier New" w:hAnsi="Courier New"/>
+          <w:color w:val="C53030"/>
+          <w:sz w:val="19"/>
+        </w:rPr>
+        <w:t>ufw allow 80,443/tcp</w:t>
+      </w:r>
+      <w:r>
+        <w:t xml:space="preserve"> or </w:t>
+      </w:r>
+      <w:r>
+        <w:rPr>
+          <w:rFonts w:ascii="Courier New" w:hAnsi="Courier New"/>
+          <w:color w:val="C53030"/>
+          <w:sz w:val="19"/>
+        </w:rPr>
+        <w:t>firewall-cmd --add-port={80,443}/tcp</w:t>
+      </w:r>
+      <w:r>
+        <w:t>).</w:t>
+      </w:r>
+    </w:p>
+    <w:p>
+      <w:pPr>
+        <w:keepNext/>
+        <w:spacing w:before="280" w:after="120"/>
+      </w:pPr>
+      <w:r>
+        <w:rPr>
+          <w:rFonts w:ascii="Arial" w:hAnsi="Arial"/>
+          <w:b/>
+          <w:color w:val="0F172A"/>
+          <w:sz w:val="24"/>
+        </w:rPr>
+        <w:t>2. Quick Linux Deployment Commands</w:t>
+      </w:r>
+    </w:p>
+    <w:tbl>
+      <w:tblPr>
+        <w:tblStyle w:val="TableGrid"/>
+        <w:tblW w:type="auto" w:w="0"/>
+        <w:tblLook w:firstColumn="1" w:firstRow="1" w:lastColumn="0" w:lastRow="0" w:noHBand="0" w:noVBand="1" w:val="04A0"/>
+      </w:tblPr>
+      <w:tblGrid>
+        <w:gridCol w:w="9360"/>
+      </w:tblGrid>
+      <w:tr>
+        <w:tc>
+          <w:tcPr>
+            <w:tcW w:type="dxa" w:w="9360"/>
+            <w:shd w:val="clear" w:color="auto" w:fill="F1F5F9"/>
+          </w:tcPr>
+          <w:p>
+            <w:pPr>
+              <w:spacing w:before="80" w:after="80"/>
+            </w:pPr>
+            <w:r>
+              <w:rPr>
+                <w:rFonts w:ascii="Courier New" w:hAnsi="Courier New"/>
+                <w:color w:val="1E293B"/>
+                <w:sz w:val="19"/>
+              </w:rPr>
+              <w:t># 1. Clone repository or extract release bundle</w:t>
+              <w:br/>
+            </w:r>
+            <w:r>
+              <w:rPr>
+                <w:rFonts w:ascii="Courier New" w:hAnsi="Courier New"/>
+                <w:color w:val="1E293B"/>
+                <w:sz w:val="19"/>
+              </w:rPr>
+              <w:t>git clone https://github.com/devdekodeglobal/optiflow-poc.git /opt/optiflow</w:t>
+              <w:br/>
+            </w:r>
+            <w:r>
+              <w:rPr>
+                <w:rFonts w:ascii="Courier New" w:hAnsi="Courier New"/>
+                <w:color w:val="1E293B"/>
+                <w:sz w:val="19"/>
+              </w:rPr>
+              <w:t>cd /opt/optiflow</w:t>
+              <w:br/>
+            </w:r>
+            <w:r>
+              <w:rPr>
+                <w:rFonts w:ascii="Courier New" w:hAnsi="Courier New"/>
+                <w:color w:val="1E293B"/>
+                <w:sz w:val="19"/>
+              </w:rPr>
+              <w:br/>
+            </w:r>
+            <w:r>
+              <w:rPr>
+                <w:rFonts w:ascii="Courier New" w:hAnsi="Courier New"/>
+                <w:color w:val="1E293B"/>
+                <w:sz w:val="19"/>
+              </w:rPr>
+              <w:t># 2. Configure Environment variables</w:t>
+              <w:br/>
+            </w:r>
+            <w:r>
+              <w:rPr>
+                <w:rFonts w:ascii="Courier New" w:hAnsi="Courier New"/>
+                <w:color w:val="1E293B"/>
+                <w:sz w:val="19"/>
+              </w:rPr>
+              <w:t>cp .env.example .env</w:t>
+              <w:br/>
+            </w:r>
+            <w:r>
+              <w:rPr>
+                <w:rFonts w:ascii="Courier New" w:hAnsi="Courier New"/>
+                <w:color w:val="1E293B"/>
+                <w:sz w:val="19"/>
+              </w:rPr>
+              <w:br/>
+            </w:r>
+            <w:r>
+              <w:rPr>
+                <w:rFonts w:ascii="Courier New" w:hAnsi="Courier New"/>
+                <w:color w:val="1E293B"/>
+                <w:sz w:val="19"/>
+              </w:rPr>
+              <w:t># 3. Build and launch all services in detached background mode</w:t>
+              <w:br/>
+            </w:r>
+            <w:r>
+              <w:rPr>
+                <w:rFonts w:ascii="Courier New" w:hAnsi="Courier New"/>
+                <w:color w:val="1E293B"/>
+                <w:sz w:val="19"/>
+              </w:rPr>
+              <w:t>docker compose up -d --build</w:t>
+            </w:r>
+          </w:p>
+        </w:tc>
+      </w:tr>
+    </w:tbl>
+    <w:p>
+      <w:pPr>
+        <w:spacing w:after="80"/>
+      </w:pPr>
+    </w:p>
+    <w:p>
+      <w:pPr>
+        <w:keepNext/>
+        <w:spacing w:before="280" w:after="120"/>
+      </w:pPr>
+      <w:r>
+        <w:rPr>
+          <w:rFonts w:ascii="Arial" w:hAnsi="Arial"/>
+          <w:b/>
+          <w:color w:val="0F172A"/>
+          <w:sz w:val="24"/>
+        </w:rPr>
+        <w:t>3. Automatic System Boot &amp; Auto-Restart (`systemd`)</w:t>
+      </w:r>
+    </w:p>
+    <w:p>
+      <w:pPr>
+        <w:spacing w:after="120"/>
+      </w:pPr>
+      <w:r>
+        <w:t xml:space="preserve">To ensure OptiFlow automatically starts whenever the physical Linux server reboots or recovers from a power outage, create a simple </w:t>
+      </w:r>
+      <w:r>
+        <w:rPr>
+          <w:rFonts w:ascii="Courier New" w:hAnsi="Courier New"/>
+          <w:color w:val="C53030"/>
+          <w:sz w:val="19"/>
+        </w:rPr>
+        <w:t>systemd</w:t>
+      </w:r>
+      <w:r>
+        <w:t xml:space="preserve"> service:</w:t>
+      </w:r>
+    </w:p>
+    <w:p>
+      <w:pPr>
+        <w:spacing w:after="120"/>
+      </w:pPr>
+      <w:r/>
+      <w:r>
+        <w:rPr>
+          <w:rFonts w:ascii="Courier New" w:hAnsi="Courier New"/>
+          <w:color w:val="C53030"/>
+          <w:sz w:val="19"/>
+        </w:rPr>
+        <w:t>/etc/systemd/system/optiflow.service</w:t>
+      </w:r>
+      <w:r>
+        <w:t>:</w:t>
+      </w:r>
+    </w:p>
+    <w:tbl>
+      <w:tblPr>
+        <w:tblStyle w:val="TableGrid"/>
+        <w:tblW w:type="auto" w:w="0"/>
+        <w:tblLook w:firstColumn="1" w:firstRow="1" w:lastColumn="0" w:lastRow="0" w:noHBand="0" w:noVBand="1" w:val="04A0"/>
+      </w:tblPr>
+      <w:tblGrid>
+        <w:gridCol w:w="9360"/>
+      </w:tblGrid>
+      <w:tr>
+        <w:tc>
+          <w:tcPr>
+            <w:tcW w:type="dxa" w:w="9360"/>
+            <w:shd w:val="clear" w:color="auto" w:fill="F1F5F9"/>
+          </w:tcPr>
+          <w:p>
+            <w:pPr>
+              <w:spacing w:before="80" w:after="80"/>
+            </w:pPr>
+            <w:r>
+              <w:rPr>
+                <w:rFonts w:ascii="Courier New" w:hAnsi="Courier New"/>
+                <w:color w:val="1E293B"/>
+                <w:sz w:val="19"/>
+              </w:rPr>
+              <w:t>[Unit]</w:t>
+              <w:br/>
+            </w:r>
+            <w:r>
+              <w:rPr>
+                <w:rFonts w:ascii="Courier New" w:hAnsi="Courier New"/>
+                <w:color w:val="1E293B"/>
+                <w:sz w:val="19"/>
+              </w:rPr>
+              <w:t>Description=OptiFlow On-Premise Application Stack</w:t>
+              <w:br/>
+            </w:r>
+            <w:r>
+              <w:rPr>
+                <w:rFonts w:ascii="Courier New" w:hAnsi="Courier New"/>
+                <w:color w:val="1E293B"/>
+                <w:sz w:val="19"/>
+              </w:rPr>
+              <w:t>After=docker.service</w:t>
+              <w:br/>
+            </w:r>
+            <w:r>
+              <w:rPr>
+                <w:rFonts w:ascii="Courier New" w:hAnsi="Courier New"/>
+                <w:color w:val="1E293B"/>
+                <w:sz w:val="19"/>
+              </w:rPr>
+              <w:t>Requires=docker.service</w:t>
+              <w:br/>
+            </w:r>
+            <w:r>
+              <w:rPr>
+                <w:rFonts w:ascii="Courier New" w:hAnsi="Courier New"/>
+                <w:color w:val="1E293B"/>
+                <w:sz w:val="19"/>
+              </w:rPr>
+              <w:br/>
+            </w:r>
+            <w:r>
+              <w:rPr>
+                <w:rFonts w:ascii="Courier New" w:hAnsi="Courier New"/>
+                <w:color w:val="1E293B"/>
+                <w:sz w:val="19"/>
+              </w:rPr>
+              <w:t>[Service]</w:t>
+              <w:br/>
+            </w:r>
+            <w:r>
+              <w:rPr>
+                <w:rFonts w:ascii="Courier New" w:hAnsi="Courier New"/>
+                <w:color w:val="1E293B"/>
+                <w:sz w:val="19"/>
+              </w:rPr>
+              <w:t>Type=oneshot</w:t>
+              <w:br/>
+            </w:r>
+            <w:r>
+              <w:rPr>
+                <w:rFonts w:ascii="Courier New" w:hAnsi="Courier New"/>
+                <w:color w:val="1E293B"/>
+                <w:sz w:val="19"/>
+              </w:rPr>
+              <w:t>RemainAfterExit=yes</w:t>
+              <w:br/>
+            </w:r>
+            <w:r>
+              <w:rPr>
+                <w:rFonts w:ascii="Courier New" w:hAnsi="Courier New"/>
+                <w:color w:val="1E293B"/>
+                <w:sz w:val="19"/>
+              </w:rPr>
+              <w:t>WorkingDirectory=/opt/optiflow</w:t>
+              <w:br/>
+            </w:r>
+            <w:r>
+              <w:rPr>
+                <w:rFonts w:ascii="Courier New" w:hAnsi="Courier New"/>
+                <w:color w:val="1E293B"/>
+                <w:sz w:val="19"/>
+              </w:rPr>
+              <w:t>ExecStart=/usr/bin/docker compose up -d</w:t>
+              <w:br/>
+            </w:r>
+            <w:r>
+              <w:rPr>
+                <w:rFonts w:ascii="Courier New" w:hAnsi="Courier New"/>
+                <w:color w:val="1E293B"/>
+                <w:sz w:val="19"/>
+              </w:rPr>
+              <w:t>ExecStop=/usr/bin/docker compose down</w:t>
+              <w:br/>
+            </w:r>
+            <w:r>
+              <w:rPr>
+                <w:rFonts w:ascii="Courier New" w:hAnsi="Courier New"/>
+                <w:color w:val="1E293B"/>
+                <w:sz w:val="19"/>
+              </w:rPr>
+              <w:br/>
+            </w:r>
+            <w:r>
+              <w:rPr>
+                <w:rFonts w:ascii="Courier New" w:hAnsi="Courier New"/>
+                <w:color w:val="1E293B"/>
+                <w:sz w:val="19"/>
+              </w:rPr>
+              <w:t>[Install]</w:t>
+              <w:br/>
+            </w:r>
+            <w:r>
+              <w:rPr>
+                <w:rFonts w:ascii="Courier New" w:hAnsi="Courier New"/>
+                <w:color w:val="1E293B"/>
+                <w:sz w:val="19"/>
+              </w:rPr>
+              <w:t>WantedBy=multi-user.target</w:t>
+            </w:r>
+          </w:p>
+        </w:tc>
+      </w:tr>
+    </w:tbl>
+    <w:p>
+      <w:pPr>
+        <w:spacing w:after="80"/>
+      </w:pPr>
+    </w:p>
+    <w:p>
+      <w:pPr>
+        <w:spacing w:after="120"/>
+      </w:pPr>
+      <w:r>
+        <w:t xml:space="preserve">Enable the service on Linux: </w:t>
+      </w:r>
+      <w:r>
+        <w:rPr>
+          <w:rFonts w:ascii="Courier New" w:hAnsi="Courier New"/>
+          <w:color w:val="C53030"/>
+          <w:sz w:val="19"/>
+        </w:rPr>
+        <w:t>sudo systemctl enable --now optiflow</w:t>
+      </w:r>
+      <w:r/>
+    </w:p>
+    <w:p>
+      <w:pPr>
+        <w:keepNext/>
+        <w:spacing w:before="280" w:after="120"/>
+      </w:pPr>
+      <w:r>
+        <w:rPr>
+          <w:rFonts w:ascii="Arial" w:hAnsi="Arial"/>
+          <w:b/>
+          <w:color w:val="0F172A"/>
+          <w:sz w:val="24"/>
+        </w:rPr>
+        <w:t>4. Data Persistence &amp; Linux Nightly Backups</w:t>
       </w:r>
     </w:p>
     <w:p>
@@ -596,10 +1053,10 @@
         <w:rPr>
           <w:b/>
         </w:rPr>
-        <w:t>Access</w:t>
+        <w:t>Database Volume</w:t>
       </w:r>
       <w:r>
-        <w:t>: Accessible over the public web via secure HTTPS (</w:t>
+        <w:t xml:space="preserve">: PostgreSQL stores data securely on the Linux host filesystem at </w:t>
       </w:r>
       <w:r>
         <w:rPr>
@@ -607,25 +1064,10 @@
           <w:color w:val="C53030"/>
           <w:sz w:val="19"/>
         </w:rPr>
-        <w:t>https://optiflow.yourdomain.com</w:t>
+        <w:t>/var/lib/docker/volumes/optiflow_postgres_data/_data</w:t>
       </w:r>
       <w:r>
-        <w:t>).</w:t>
-      </w:r>
-    </w:p>
-    <w:p>
-      <w:pPr>
-        <w:keepNext/>
-        <w:spacing w:before="280" w:after="120"/>
-      </w:pPr>
-      <w:r>
-        <w:rPr>
-          <w:rFonts w:ascii="Arial" w:hAnsi="Arial"/>
-          <w:b/>
-          <w:color w:val="0F172A"/>
-          <w:sz w:val="24"/>
-        </w:rPr>
-        <w:t>2. On-Premise Deployment (Local Warehouse / Data Center)</w:t>
+        <w:t>.</w:t>
       </w:r>
     </w:p>
     <w:p>
@@ -645,56 +1087,10 @@
         <w:rPr>
           <w:b/>
         </w:rPr>
-        <w:t>Hosting</w:t>
+        <w:t>Automated Nightly Backup</w:t>
       </w:r>
       <w:r>
-        <w:t>: The exact same Docker containers run on the client's internal physical server or local Virtual Machine (VMware / Proxmox).</w:t>
-      </w:r>
-    </w:p>
-    <w:p>
-      <w:pPr>
-        <w:spacing w:after="80"/>
-        <w:ind w:left="576"/>
-      </w:pPr>
-      <w:r>
-        <w:rPr>
-          <w:b/>
-          <w:color w:val="0F172A"/>
-        </w:rPr>
-        <w:t xml:space="preserve">•  </w:t>
-      </w:r>
-      <w:r/>
-      <w:r>
-        <w:rPr>
-          <w:b/>
-        </w:rPr>
-        <w:t>Database</w:t>
-      </w:r>
-      <w:r>
-        <w:t>: PostgreSQL runs inside a Docker container with local volume storage or connects to the client's internal PostgreSQL cluster.</w:t>
-      </w:r>
-    </w:p>
-    <w:p>
-      <w:pPr>
-        <w:spacing w:after="80"/>
-        <w:ind w:left="576"/>
-      </w:pPr>
-      <w:r>
-        <w:rPr>
-          <w:b/>
-          <w:color w:val="0F172A"/>
-        </w:rPr>
-        <w:t xml:space="preserve">•  </w:t>
-      </w:r>
-      <w:r/>
-      <w:r>
-        <w:rPr>
-          <w:b/>
-        </w:rPr>
-        <w:t>Access</w:t>
-      </w:r>
-      <w:r>
-        <w:t>: Accessible strictly over the company's internal network/Intranet (</w:t>
+        <w:t xml:space="preserve">: Add a simple Linux </w:t>
       </w:r>
       <w:r>
         <w:rPr>
@@ -702,10 +1098,10 @@
           <w:color w:val="C53030"/>
           <w:sz w:val="19"/>
         </w:rPr>
-        <w:t>http://192.168.1.50</w:t>
+        <w:t>cron</w:t>
       </w:r>
       <w:r>
-        <w:t xml:space="preserve"> or </w:t>
+        <w:t xml:space="preserve"> job (</w:t>
       </w:r>
       <w:r>
         <w:rPr>
@@ -713,11 +1109,436 @@
           <w:color w:val="C53030"/>
           <w:sz w:val="19"/>
         </w:rPr>
-        <w:t>http://optiflow.local</w:t>
+        <w:t>/etc/cron.daily/optiflow-backup</w:t>
       </w:r>
       <w:r>
-        <w:t>).</w:t>
+        <w:t>) to perform nightly database dumps:</w:t>
       </w:r>
+    </w:p>
+    <w:tbl>
+      <w:tblPr>
+        <w:tblStyle w:val="TableGrid"/>
+        <w:tblW w:type="auto" w:w="0"/>
+        <w:tblLook w:firstColumn="1" w:firstRow="1" w:lastColumn="0" w:lastRow="0" w:noHBand="0" w:noVBand="1" w:val="04A0"/>
+      </w:tblPr>
+      <w:tblGrid>
+        <w:gridCol w:w="9360"/>
+      </w:tblGrid>
+      <w:tr>
+        <w:tc>
+          <w:tcPr>
+            <w:tcW w:type="dxa" w:w="9360"/>
+            <w:shd w:val="clear" w:color="auto" w:fill="F1F5F9"/>
+          </w:tcPr>
+          <w:p>
+            <w:pPr>
+              <w:spacing w:before="80" w:after="80"/>
+            </w:pPr>
+            <w:r>
+              <w:rPr>
+                <w:rFonts w:ascii="Courier New" w:hAnsi="Courier New"/>
+                <w:color w:val="1E293B"/>
+                <w:sz w:val="19"/>
+              </w:rPr>
+              <w:t>#!/bin/bash</w:t>
+              <w:br/>
+            </w:r>
+            <w:r>
+              <w:rPr>
+                <w:rFonts w:ascii="Courier New" w:hAnsi="Courier New"/>
+                <w:color w:val="1E293B"/>
+                <w:sz w:val="19"/>
+              </w:rPr>
+              <w:t>BACKUP_DIR="/var/backups/optiflow"</w:t>
+              <w:br/>
+            </w:r>
+            <w:r>
+              <w:rPr>
+                <w:rFonts w:ascii="Courier New" w:hAnsi="Courier New"/>
+                <w:color w:val="1E293B"/>
+                <w:sz w:val="19"/>
+              </w:rPr>
+              <w:t>mkdir -p $BACKUP_DIR</w:t>
+              <w:br/>
+            </w:r>
+            <w:r>
+              <w:rPr>
+                <w:rFonts w:ascii="Courier New" w:hAnsi="Courier New"/>
+                <w:color w:val="1E293B"/>
+                <w:sz w:val="19"/>
+              </w:rPr>
+              <w:t>docker exec optiflow-postgres-1 pg_dump -U optiflow_user optiflow_db | gzip &gt; "$BACKUP_DIR/optiflow_$(date +%Y%m%d).sql.gz"</w:t>
+              <w:br/>
+            </w:r>
+            <w:r>
+              <w:rPr>
+                <w:rFonts w:ascii="Courier New" w:hAnsi="Courier New"/>
+                <w:color w:val="1E293B"/>
+                <w:sz w:val="19"/>
+              </w:rPr>
+              <w:t>find $BACKUP_DIR -type f -mtime +30 -delete</w:t>
+            </w:r>
+          </w:p>
+        </w:tc>
+      </w:tr>
+    </w:tbl>
+    <w:p>
+      <w:pPr>
+        <w:spacing w:after="80"/>
+      </w:pPr>
+    </w:p>
+    <w:p>
+      <w:pPr>
+        <w:spacing w:before="240" w:after="240"/>
+        <w:jc w:val="center"/>
+      </w:pPr>
+      <w:r>
+        <w:rPr>
+          <w:color w:val="DCDCDC"/>
+        </w:rPr>
+        <w:t>——————————————————————————————————————————————————</w:t>
+      </w:r>
+    </w:p>
+    <w:p>
+      <w:pPr>
+        <w:keepNext/>
+        <w:spacing w:before="360" w:after="160"/>
+      </w:pPr>
+      <w:r>
+        <w:rPr>
+          <w:rFonts w:ascii="Arial" w:hAnsi="Arial"/>
+          <w:b/>
+          <w:color w:val="053364"/>
+          <w:sz w:val="28"/>
+        </w:rPr>
+        <w:t>Cloud vs. On-Premise Deployment Comparison</w:t>
+      </w:r>
+    </w:p>
+    <w:tbl>
+      <w:tblPr>
+        <w:tblStyle w:val="TableGrid"/>
+        <w:tblW w:type="auto" w:w="0"/>
+        <w:tblLayout w:type="fixed"/>
+        <w:tblLook w:firstColumn="1" w:firstRow="1" w:lastColumn="0" w:lastRow="0" w:noHBand="0" w:noVBand="1" w:val="04A0"/>
+      </w:tblPr>
+      <w:tblGrid>
+        <w:gridCol w:w="3120"/>
+        <w:gridCol w:w="3120"/>
+        <w:gridCol w:w="3120"/>
+      </w:tblGrid>
+      <w:tr>
+        <w:tc>
+          <w:tcPr>
+            <w:tcW w:type="dxa" w:w="2880"/>
+            <w:shd w:val="clear" w:color="auto" w:fill="0B1D3A"/>
+          </w:tcPr>
+          <w:p>
+            <w:pPr>
+              <w:spacing w:before="80" w:after="80"/>
+            </w:pPr>
+            <w:r>
+              <w:rPr>
+                <w:b/>
+                <w:color w:val="FFFFFF"/>
+              </w:rPr>
+              <w:t>Metric</w:t>
+            </w:r>
+          </w:p>
+        </w:tc>
+        <w:tc>
+          <w:tcPr>
+            <w:tcW w:type="dxa" w:w="3168"/>
+            <w:shd w:val="clear" w:color="auto" w:fill="0B1D3A"/>
+          </w:tcPr>
+          <w:p>
+            <w:pPr>
+              <w:spacing w:before="80" w:after="80"/>
+            </w:pPr>
+            <w:r>
+              <w:rPr>
+                <w:b/>
+                <w:color w:val="FFFFFF"/>
+              </w:rPr>
+              <w:t>Cloud Deployment (AWS / GCP)</w:t>
+            </w:r>
+          </w:p>
+        </w:tc>
+        <w:tc>
+          <w:tcPr>
+            <w:tcW w:type="dxa" w:w="3312"/>
+            <w:shd w:val="clear" w:color="auto" w:fill="0B1D3A"/>
+          </w:tcPr>
+          <w:p>
+            <w:pPr>
+              <w:spacing w:before="80" w:after="80"/>
+            </w:pPr>
+            <w:r>
+              <w:rPr>
+                <w:b/>
+                <w:color w:val="FFFFFF"/>
+              </w:rPr>
+              <w:t>On-Premise Deployment (Linux Server)</w:t>
+            </w:r>
+          </w:p>
+        </w:tc>
+      </w:tr>
+      <w:tr>
+        <w:tc>
+          <w:tcPr>
+            <w:tcW w:type="dxa" w:w="2880"/>
+          </w:tcPr>
+          <w:p>
+            <w:pPr>
+              <w:spacing w:before="80" w:after="80"/>
+            </w:pPr>
+            <w:r/>
+            <w:r>
+              <w:rPr>
+                <w:b/>
+              </w:rPr>
+              <w:t>Operating System</w:t>
+            </w:r>
+            <w:r/>
+          </w:p>
+        </w:tc>
+        <w:tc>
+          <w:tcPr>
+            <w:tcW w:type="dxa" w:w="3168"/>
+          </w:tcPr>
+          <w:p>
+            <w:pPr>
+              <w:spacing w:before="80" w:after="80"/>
+            </w:pPr>
+            <w:r>
+              <w:t>Managed Linux VM (Ubuntu/Amazon Linux)</w:t>
+            </w:r>
+          </w:p>
+        </w:tc>
+        <w:tc>
+          <w:tcPr>
+            <w:tcW w:type="dxa" w:w="3312"/>
+          </w:tcPr>
+          <w:p>
+            <w:pPr>
+              <w:spacing w:before="80" w:after="80"/>
+            </w:pPr>
+            <w:r>
+              <w:t>Enterprise Linux Server (Ubuntu / RHEL)</w:t>
+            </w:r>
+          </w:p>
+        </w:tc>
+      </w:tr>
+      <w:tr>
+        <w:tc>
+          <w:tcPr>
+            <w:tcW w:type="dxa" w:w="2880"/>
+          </w:tcPr>
+          <w:p>
+            <w:pPr>
+              <w:spacing w:before="80" w:after="80"/>
+            </w:pPr>
+            <w:r/>
+            <w:r>
+              <w:rPr>
+                <w:b/>
+              </w:rPr>
+              <w:t>Network Endpoint</w:t>
+            </w:r>
+            <w:r/>
+          </w:p>
+        </w:tc>
+        <w:tc>
+          <w:tcPr>
+            <w:tcW w:type="dxa" w:w="3168"/>
+          </w:tcPr>
+          <w:p>
+            <w:pPr>
+              <w:spacing w:before="80" w:after="80"/>
+            </w:pPr>
+            <w:r>
+              <w:t>Public HTTPS Domain (</w:t>
+            </w:r>
+            <w:r>
+              <w:rPr>
+                <w:rFonts w:ascii="Courier New" w:hAnsi="Courier New"/>
+                <w:color w:val="C53030"/>
+                <w:sz w:val="19"/>
+              </w:rPr>
+              <w:t>optiflow.company.com</w:t>
+            </w:r>
+            <w:r>
+              <w:t>)</w:t>
+            </w:r>
+          </w:p>
+        </w:tc>
+        <w:tc>
+          <w:tcPr>
+            <w:tcW w:type="dxa" w:w="3312"/>
+          </w:tcPr>
+          <w:p>
+            <w:pPr>
+              <w:spacing w:before="80" w:after="80"/>
+            </w:pPr>
+            <w:r>
+              <w:t>Internal LAN IP (</w:t>
+            </w:r>
+            <w:r>
+              <w:rPr>
+                <w:rFonts w:ascii="Courier New" w:hAnsi="Courier New"/>
+                <w:color w:val="C53030"/>
+                <w:sz w:val="19"/>
+              </w:rPr>
+              <w:t>http://192.168.1.50</w:t>
+            </w:r>
+            <w:r>
+              <w:t>)</w:t>
+            </w:r>
+          </w:p>
+        </w:tc>
+      </w:tr>
+      <w:tr>
+        <w:tc>
+          <w:tcPr>
+            <w:tcW w:type="dxa" w:w="2880"/>
+          </w:tcPr>
+          <w:p>
+            <w:pPr>
+              <w:spacing w:before="80" w:after="80"/>
+            </w:pPr>
+            <w:r/>
+            <w:r>
+              <w:rPr>
+                <w:b/>
+              </w:rPr>
+              <w:t>Database Host</w:t>
+            </w:r>
+            <w:r/>
+          </w:p>
+        </w:tc>
+        <w:tc>
+          <w:tcPr>
+            <w:tcW w:type="dxa" w:w="3168"/>
+          </w:tcPr>
+          <w:p>
+            <w:pPr>
+              <w:spacing w:before="80" w:after="80"/>
+            </w:pPr>
+            <w:r>
+              <w:t>Cloud Managed DB (AWS RDS PostgreSQL)</w:t>
+            </w:r>
+          </w:p>
+        </w:tc>
+        <w:tc>
+          <w:tcPr>
+            <w:tcW w:type="dxa" w:w="3312"/>
+          </w:tcPr>
+          <w:p>
+            <w:pPr>
+              <w:spacing w:before="80" w:after="80"/>
+            </w:pPr>
+            <w:r>
+              <w:t>Dockerized PostgreSQL on Linux Disk</w:t>
+            </w:r>
+          </w:p>
+        </w:tc>
+      </w:tr>
+      <w:tr>
+        <w:tc>
+          <w:tcPr>
+            <w:tcW w:type="dxa" w:w="2880"/>
+          </w:tcPr>
+          <w:p>
+            <w:pPr>
+              <w:spacing w:before="80" w:after="80"/>
+            </w:pPr>
+            <w:r/>
+            <w:r>
+              <w:rPr>
+                <w:b/>
+              </w:rPr>
+              <w:t>Hardware Control</w:t>
+            </w:r>
+            <w:r/>
+          </w:p>
+        </w:tc>
+        <w:tc>
+          <w:tcPr>
+            <w:tcW w:type="dxa" w:w="3168"/>
+          </w:tcPr>
+          <w:p>
+            <w:pPr>
+              <w:spacing w:before="80" w:after="80"/>
+            </w:pPr>
+            <w:r>
+              <w:t>Virtual Cloud vCPU &amp; RAM</w:t>
+            </w:r>
+          </w:p>
+        </w:tc>
+        <w:tc>
+          <w:tcPr>
+            <w:tcW w:type="dxa" w:w="3312"/>
+          </w:tcPr>
+          <w:p>
+            <w:pPr>
+              <w:spacing w:before="80" w:after="80"/>
+            </w:pPr>
+            <w:r>
+              <w:t>Physical Server Hardware in Warehouse</w:t>
+            </w:r>
+          </w:p>
+        </w:tc>
+      </w:tr>
+      <w:tr>
+        <w:tc>
+          <w:tcPr>
+            <w:tcW w:type="dxa" w:w="2880"/>
+          </w:tcPr>
+          <w:p>
+            <w:pPr>
+              <w:spacing w:before="80" w:after="80"/>
+            </w:pPr>
+            <w:r/>
+            <w:r>
+              <w:rPr>
+                <w:b/>
+              </w:rPr>
+              <w:t>Portability</w:t>
+            </w:r>
+            <w:r/>
+          </w:p>
+        </w:tc>
+        <w:tc>
+          <w:tcPr>
+            <w:tcW w:type="dxa" w:w="3168"/>
+          </w:tcPr>
+          <w:p>
+            <w:pPr>
+              <w:spacing w:before="80" w:after="80"/>
+            </w:pPr>
+            <w:r>
+              <w:t>Identical Docker Compose Configuration</w:t>
+            </w:r>
+          </w:p>
+        </w:tc>
+        <w:tc>
+          <w:tcPr>
+            <w:tcW w:type="dxa" w:w="3312"/>
+          </w:tcPr>
+          <w:p>
+            <w:pPr>
+              <w:spacing w:before="80" w:after="80"/>
+            </w:pPr>
+            <w:r>
+              <w:t>Identical Docker Compose Configuration</w:t>
+            </w:r>
+          </w:p>
+        </w:tc>
+      </w:tr>
+    </w:tbl>
+    <w:p>
+      <w:pPr>
+        <w:spacing w:after="120"/>
+      </w:pPr>
     </w:p>
     <w:p>
       <w:pPr>
@@ -763,10 +1584,10 @@
         <w:rPr>
           <w:b/>
         </w:rPr>
-        <w:t>Zero Licensing Costs</w:t>
+        <w:t>Zero Software License Fees</w:t>
       </w:r>
       <w:r>
-        <w:t>: The entire stack utilizes 100% open-source technologies with no recurring vendor software fees.</w:t>
+        <w:t>: Runs 100% on free, open-source Linux software stack.</w:t>
       </w:r>
     </w:p>
     <w:p>
@@ -786,10 +1607,21 @@
         <w:rPr>
           <w:b/>
         </w:rPr>
-        <w:t>Non-Blocking User Experience</w:t>
+        <w:t>Resilient On-Premise Recovery</w:t>
       </w:r>
       <w:r>
-        <w:t>: Heavy allocation algorithms run asynchronously in background Celery workers, keeping the manager dashboard fast and responsive.</w:t>
+        <w:t xml:space="preserve">: Linux </w:t>
+      </w:r>
+      <w:r>
+        <w:rPr>
+          <w:rFonts w:ascii="Courier New" w:hAnsi="Courier New"/>
+          <w:color w:val="C53030"/>
+          <w:sz w:val="19"/>
+        </w:rPr>
+        <w:t>systemd</w:t>
+      </w:r>
+      <w:r>
+        <w:t xml:space="preserve"> auto-restarts services automatically after server power cycles.</w:t>
       </w:r>
     </w:p>
     <w:p>
@@ -809,10 +1641,10 @@
         <w:rPr>
           <w:b/>
         </w:rPr>
-        <w:t>Data Integrity &amp; Scale</w:t>
+        <w:t>Isolated Host Environment</w:t>
       </w:r>
       <w:r>
-        <w:t>: PostgreSQL provides ACID compliance for inventory movements and scales to handle millions of historical sales records.</w:t>
+        <w:t>: Docker isolates all app dependencies from the main Linux host OS.</w:t>
       </w:r>
     </w:p>
     <w:p>
@@ -832,10 +1664,10 @@
         <w:rPr>
           <w:b/>
         </w:rPr>
-        <w:t>Instant On-Premise Portability</w:t>
+        <w:t>Data Integrity &amp; Automated Backups</w:t>
       </w:r>
       <w:r>
-        <w:t>: Moving from Cloud to On-Premise requires zero code modifications—only environment configurations.</w:t>
+        <w:t>: PostgreSQL ACID compliance paired with native Linux automated cron backups.</w:t>
       </w:r>
     </w:p>
     <w:sectPr>

</xml_diff>